<commit_message>
v2.0.0: Random Forest PBC classifier, CNN roof model
</commit_message>
<xml_diff>
--- a/analizaWZ_szablony/analiza_wz_szablon 1_budynek.docx
+++ b/analizaWZ_szablony/analiza_wz_szablon 1_budynek.docx
@@ -21,24 +21,7 @@
         <w:tab/>
         <w:tab/>
         <w:tab/>
-      </w:r>
-      <w:r>
-        <w:rPr>
-          <w:rFonts w:cs="Arial" w:ascii="Arial" w:hAnsi="Arial"/>
-          <w:b w:val="false"/>
-          <w:sz w:val="22"/>
-          <w:szCs w:val="22"/>
-        </w:rPr>
-        <w:t>{{nazwa_gminy}}</w:t>
-      </w:r>
-      <w:r>
-        <w:rPr>
-          <w:rFonts w:cs="Arial" w:ascii="Arial" w:hAnsi="Arial"/>
-          <w:b w:val="false"/>
-          <w:sz w:val="22"/>
-          <w:szCs w:val="22"/>
-        </w:rPr>
-        <w:t>, dnia {{today}}</w:t>
+        <w:t>Ostrów Wielkopolski, dnia {{today}}</w:t>
       </w:r>
     </w:p>
     <w:p>
@@ -258,7 +241,7 @@
           <w:sz w:val="22"/>
           <w:szCs w:val="22"/>
         </w:rPr>
-        <w:t xml:space="preserve">{{Nazwa_inwestycji}} przewidziana do realizacji na działce/działkach nr {{nr_dzialki}} (obręb {{nr_obrebu}}) położonej w </w:t>
+        <w:t xml:space="preserve">{{Nazwa_inwestycji}} przewidziana do realizacji na działce/działkach nr {{nr_dzialki}} (obręb {{nr_obrebu}}) położonej w Ostrowie Wielkopolskim </w:t>
       </w:r>
       <w:r>
         <w:rPr>
@@ -267,16 +250,7 @@
           <w:sz w:val="22"/>
           <w:szCs w:val="22"/>
         </w:rPr>
-        <w:t xml:space="preserve">gminie </w:t>
-      </w:r>
-      <w:r>
-        <w:rPr>
-          <w:rFonts w:cs="Arial" w:ascii="Arial" w:hAnsi="Arial"/>
-          <w:b w:val="false"/>
-          <w:sz w:val="22"/>
-          <w:szCs w:val="22"/>
-        </w:rPr>
-        <w:t>{{nazwa_gminy}}.</w:t>
+        <w:t>przy ulicy {{adres_dzialki}}</w:t>
       </w:r>
     </w:p>
     <w:p>
@@ -339,7 +313,25 @@
           <w:sz w:val="22"/>
           <w:szCs w:val="22"/>
         </w:rPr>
-        <w:t>a. W celu ustalenia wymagań dla nowej zabudowy i zagospodarowania terenu wyznacza się wokół działki budowlanej, której dotyczy wniosek o ustalenie warunków zabudowy obszar analizowany i przeprowadza w nim analizę funkcji oraz cech zabudowy i zagospodarowania terenu w zakresie warunków, o których mowa w art. 61 ust. 1-6 ustawy z dnia 27 marca 2003 r. o planowaniu i zagospodarowaniu przestrzennym. Granice obszaru analizowanego wyznaczono na kopii mapy zasadniczej lub mapy ewidencyjnej dołączonej do wniosku o ustalenie warunków zabudowy jako obszar w odległości równej trzykrotnej szerokości frontu terenu i nie mniejszym niż 50,0 metrów (front działki posiada długość ok. {{dlugosc_frontu}}, w związku z czym ustalono promień obszaru analizowanego na {{promien_bufora}}), o którym mowa w art. 52 ust. 2 pkt 1a - zgodnie z art. 61 ust. 5a ustawy z dnia 27 marca 2003 r. o planowaniu i zagospodarowaniu przestrzennym.</w:t>
+        <w:t xml:space="preserve">a. W celu ustalenia wymagań dla nowej zabudowy i zagospodarowania terenu wyznacza się wokół działki budowlanej, której dotyczy wniosek o ustalenie warunków zabudowy obszar analizowany i przeprowadza w nim analizę funkcji oraz cech zabudowy i zagospodarowania terenu w zakresie warunków, o których mowa w art. 61 ust. 1-6 ustawy z dnia 27 marca 2003 r. o planowaniu i zagospodarowaniu przestrzennym. Granice obszaru analizowanego wyznaczono na kopii mapy zasadniczej lub mapy ewidencyjnej dołączonej do wniosku o ustalenie warunków zabudowy jako obszar w odległości równej trzykrotnej szerokości frontu terenu i nie mniejszym niż 50,0 metrów </w:t>
+      </w:r>
+      <w:r>
+        <w:rPr>
+          <w:rFonts w:cs="Arial" w:ascii="Arial" w:hAnsi="Arial"/>
+          <w:b w:val="false"/>
+          <w:sz w:val="22"/>
+          <w:szCs w:val="22"/>
+        </w:rPr>
+        <w:t xml:space="preserve">oraz nie większym niż 200 metrów </w:t>
+      </w:r>
+      <w:r>
+        <w:rPr>
+          <w:rFonts w:cs="Arial" w:ascii="Arial" w:hAnsi="Arial"/>
+          <w:b w:val="false"/>
+          <w:sz w:val="22"/>
+          <w:szCs w:val="22"/>
+        </w:rPr>
+        <w:t>(front działki posiada długość ok. {{dlugosc_frontu}}, w związku z czym ustalono promień obszaru analizowanego na {{promien_bufora}}), o którym mowa w art. 52 ust. 2 pkt 1a - zgodnie z art. 61 ust. 5a ustawy z dnia 27 marca 2003 r. o planowaniu i zagospodarowaniu przestrzennym.</w:t>
       </w:r>
     </w:p>
     <w:p>
@@ -1370,43 +1362,7 @@
           <w:sz w:val="22"/>
           <w:szCs w:val="22"/>
         </w:rPr>
-        <w:t xml:space="preserve">a) </w:t>
-      </w:r>
-      <w:r>
-        <w:rPr>
-          <w:rFonts w:cs="Arial" w:ascii="Arial" w:hAnsi="Arial"/>
-          <w:b w:val="false"/>
-          <w:sz w:val="22"/>
-          <w:szCs w:val="22"/>
-        </w:rPr>
-        <w:t xml:space="preserve">Lokalny </w:t>
-      </w:r>
-      <w:r>
-        <w:rPr>
-          <w:rFonts w:cs="Arial" w:ascii="Arial" w:hAnsi="Arial"/>
-          <w:b w:val="false"/>
-          <w:sz w:val="22"/>
-          <w:szCs w:val="22"/>
-        </w:rPr>
-        <w:t xml:space="preserve">Operator </w:t>
-      </w:r>
-      <w:r>
-        <w:rPr>
-          <w:rFonts w:cs="Arial" w:ascii="Arial" w:hAnsi="Arial"/>
-          <w:b w:val="false"/>
-          <w:sz w:val="22"/>
-          <w:szCs w:val="22"/>
-        </w:rPr>
-        <w:t>Sieci Elektroenergetycznej</w:t>
-      </w:r>
-      <w:r>
-        <w:rPr>
-          <w:rFonts w:cs="Arial" w:ascii="Arial" w:hAnsi="Arial"/>
-          <w:b w:val="false"/>
-          <w:sz w:val="22"/>
-          <w:szCs w:val="22"/>
-        </w:rPr>
-        <w:t xml:space="preserve"> zobowiązuje się zapewnić zaopatrzenie w energię elektryczną zgodnie z pismem załączonym do wniosku.</w:t>
+        <w:t>a) Operator ENERGA S.A. zobowiązuje się zapewnić zaopatrzenie w energię elektryczną zgodnie z pismem załączonym do wniosku.</w:t>
       </w:r>
     </w:p>
     <w:p>
@@ -1424,43 +1380,7 @@
           <w:sz w:val="22"/>
           <w:szCs w:val="22"/>
         </w:rPr>
-        <w:t xml:space="preserve">b) </w:t>
-      </w:r>
-      <w:r>
-        <w:rPr>
-          <w:rFonts w:cs="Arial" w:ascii="Arial" w:hAnsi="Arial"/>
-          <w:b w:val="false"/>
-          <w:sz w:val="22"/>
-          <w:szCs w:val="22"/>
-        </w:rPr>
-        <w:t xml:space="preserve">Lokalne </w:t>
-      </w:r>
-      <w:r>
-        <w:rPr>
-          <w:rFonts w:cs="Arial" w:ascii="Arial" w:hAnsi="Arial"/>
-          <w:b w:val="false"/>
-          <w:sz w:val="22"/>
-          <w:szCs w:val="22"/>
-        </w:rPr>
-        <w:t xml:space="preserve">Przedsiębiorstwo </w:t>
-      </w:r>
-      <w:r>
-        <w:rPr>
-          <w:rFonts w:cs="Arial" w:ascii="Arial" w:hAnsi="Arial"/>
-          <w:b w:val="false"/>
-          <w:sz w:val="22"/>
-          <w:szCs w:val="22"/>
-        </w:rPr>
-        <w:t>Wodociągowe</w:t>
-      </w:r>
-      <w:r>
-        <w:rPr>
-          <w:rFonts w:cs="Arial" w:ascii="Arial" w:hAnsi="Arial"/>
-          <w:b w:val="false"/>
-          <w:sz w:val="22"/>
-          <w:szCs w:val="22"/>
-        </w:rPr>
-        <w:t xml:space="preserve"> podaje, że przedmiotowa działka posiada dostęp do sieci wodociągowej oraz sieci kanalizacji sanitarnej i deszczowej w ulicy {{adres_dzialki}}, zgodnie z pismem załączonym do wniosku</w:t>
+        <w:t>b) Przedsiębiorstwo WODKAN podaje, że przedmiotowa działka posiada dostęp do sieci wodociągowej oraz sieci kanalizacji sanitarnej i deszczowej w ulicy {{adres_dzialki}}, zgodnie z pismem załączonym do wniosku</w:t>
       </w:r>
     </w:p>
     <w:p>
@@ -1784,7 +1704,10 @@
         </w:rPr>
       </w:pPr>
       <w:r>
-        <w:rPr/>
+        <w:rPr>
+          <w:sz w:val="22"/>
+          <w:szCs w:val="22"/>
+        </w:rPr>
       </w:r>
     </w:p>
     <w:p>
@@ -1904,34 +1827,7 @@
           <w:sz w:val="20"/>
           <w:szCs w:val="20"/>
         </w:rPr>
-        <w:t xml:space="preserve">Urbanista mgr inż. </w:t>
-      </w:r>
-      <w:r>
-        <w:rPr>
-          <w:rFonts w:cs="Arial" w:ascii="Arial" w:hAnsi="Arial"/>
-          <w:b w:val="false"/>
-          <w:sz w:val="20"/>
-          <w:szCs w:val="20"/>
-        </w:rPr>
-        <w:t>Imię</w:t>
-      </w:r>
-      <w:r>
-        <w:rPr>
-          <w:rFonts w:cs="Arial" w:ascii="Arial" w:hAnsi="Arial"/>
-          <w:b w:val="false"/>
-          <w:sz w:val="20"/>
-          <w:szCs w:val="20"/>
-        </w:rPr>
-        <w:t xml:space="preserve"> </w:t>
-      </w:r>
-      <w:r>
-        <w:rPr>
-          <w:rFonts w:cs="Arial" w:ascii="Arial" w:hAnsi="Arial"/>
-          <w:b w:val="false"/>
-          <w:sz w:val="20"/>
-          <w:szCs w:val="20"/>
-        </w:rPr>
-        <w:t>Nazwisko</w:t>
+        <w:t>Urbanista mgr inż. Andrzej Jagucki</w:t>
       </w:r>
     </w:p>
     <w:p>

</xml_diff>